<commit_message>
Improve mobile UX and align resume copy with site.
Refactor hero impact into a dedicated teaser, add overlay menus and a mobile-first header, tighten contact and download layouts, sync Terraform onboarding wording across site and ATS files, and strip phone contact lines from PDF generation.
</commit_message>
<xml_diff>
--- a/docs/vivek-mankonda-resume.docx
+++ b/docs/vivek-mankonda-resume.docx
@@ -329,18 +329,18 @@
           <w:sz w:val="24"/>
           <w:sz-cs w:val="24"/>
         </w:rPr>
-        <w:t xml:space="preserve">- Automated enterprise customer onboarding with Terraform Infrastructure-as-Code modules for thousands of AWS accounts.</w:t>
-      </w:r>
-    </w:p>
-    <w:p>
-      <w:pPr/>
-      <w:r>
-        <w:rPr>
-          <w:rFonts w:ascii="Helvetica Light" w:hAnsi="Helvetica Light" w:cs="Helvetica Light"/>
-          <w:sz w:val="24"/>
-          <w:sz-cs w:val="24"/>
-        </w:rPr>
-        <w:t xml:space="preserve">- Replaced manual cloud UI configuration with auditable, version-controlled telemetry pipelines at scale.</w:t>
+        <w:t xml:space="preserve">- Automated enterprise customer onboarding with Terraform.</w:t>
+      </w:r>
+    </w:p>
+    <w:p>
+      <w:pPr/>
+      <w:r>
+        <w:rPr>
+          <w:rFonts w:ascii="Helvetica Light" w:hAnsi="Helvetica Light" w:cs="Helvetica Light"/>
+          <w:sz w:val="24"/>
+          <w:sz-cs w:val="24"/>
+        </w:rPr>
+        <w:t xml:space="preserve">- Implemented Infrastructure-as-Code modules for thousands of AWS accounts; replaced manual UI configuration with auditable telemetry pipelines at scale.</w:t>
       </w:r>
     </w:p>
     <w:p>

</xml_diff>